<commit_message>
Verify scalar data flow and harden the educational analysis workbench
</commit_message>
<xml_diff>
--- a/docs/CodeSentinel_Product_Guide.docx
+++ b/docs/CodeSentinel_Product_Guide.docx
@@ -7,7 +7,10 @@
         <w:pStyle w:val="Title"/>
       </w:pPr>
       <w:r>
-        <w:t>CodeSentinel Product Guide</w:t>
+        <w:rPr>
+          <w:color w:val="000000"/>
+        </w:rPr>
+        <w:t>CodeSentinel product guide</w:t>
       </w:r>
     </w:p>
     <w:p>
@@ -28,6 +31,9 @@
         <w:pStyle w:val="Heading2"/>
       </w:pPr>
       <w:r>
+        <w:rPr>
+          <w:color w:val="000000"/>
+        </w:rPr>
         <w:t>Why this product is useful</w:t>
       </w:r>
     </w:p>
@@ -46,6 +52,9 @@
         <w:pStyle w:val="Heading2"/>
       </w:pPr>
       <w:r>
+        <w:rPr>
+          <w:color w:val="000000"/>
+        </w:rPr>
         <w:t>Who can use it</w:t>
       </w:r>
     </w:p>
@@ -60,15 +69,14 @@
       </w:r>
     </w:p>
     <w:p>
-      <w:r>
-        <w:br w:type="page"/>
-      </w:r>
-    </w:p>
-    <w:p>
       <w:pPr>
         <w:pStyle w:val="Heading1"/>
+        <w:pageBreakBefore/>
       </w:pPr>
       <w:r>
+        <w:rPr>
+          <w:color w:val="000000"/>
+        </w:rPr>
         <w:t>The workspace and compiler features</w:t>
       </w:r>
     </w:p>
@@ -77,6 +85,9 @@
         <w:pStyle w:val="Heading2"/>
       </w:pPr>
       <w:r>
+        <w:rPr>
+          <w:color w:val="000000"/>
+        </w:rPr>
         <w:t>A source editor beside the results</w:t>
       </w:r>
     </w:p>
@@ -90,6 +101,9 @@
         <w:pStyle w:val="Heading2"/>
       </w:pPr>
       <w:r>
+        <w:rPr>
+          <w:color w:val="000000"/>
+        </w:rPr>
         <w:t>The five main result tabs</w:t>
       </w:r>
     </w:p>
@@ -129,10 +143,6 @@
               <w:spacing w:after="40" w:line="252" w:lineRule="auto"/>
             </w:pPr>
             <w:r>
-              <w:rPr>
-                <w:b/>
-                <w:sz w:val="18"/>
-              </w:rPr>
               <w:t>Tab</w:t>
             </w:r>
           </w:p>
@@ -159,10 +169,6 @@
               <w:spacing w:after="40" w:line="252" w:lineRule="auto"/>
             </w:pPr>
             <w:r>
-              <w:rPr>
-                <w:b/>
-                <w:sz w:val="18"/>
-              </w:rPr>
               <w:t>What the reader can inspect</w:t>
             </w:r>
           </w:p>
@@ -194,10 +200,6 @@
               <w:spacing w:after="40" w:line="252" w:lineRule="auto"/>
             </w:pPr>
             <w:r>
-              <w:rPr>
-                <w:b w:val="0"/>
-                <w:sz w:val="18"/>
-              </w:rPr>
               <w:t>Overview</w:t>
             </w:r>
           </w:p>
@@ -224,10 +226,6 @@
               <w:spacing w:after="40" w:line="252" w:lineRule="auto"/>
             </w:pPr>
             <w:r>
-              <w:rPr>
-                <w:b w:val="0"/>
-                <w:sz w:val="18"/>
-              </w:rPr>
               <w:t>Function, token, finding, and transformation counts, plus stage coverage.</w:t>
             </w:r>
           </w:p>
@@ -259,10 +257,6 @@
               <w:spacing w:after="40" w:line="252" w:lineRule="auto"/>
             </w:pPr>
             <w:r>
-              <w:rPr>
-                <w:b w:val="0"/>
-                <w:sz w:val="18"/>
-              </w:rPr>
               <w:t>Diagnostics</w:t>
             </w:r>
           </w:p>
@@ -289,10 +283,6 @@
               <w:spacing w:after="40" w:line="252" w:lineRule="auto"/>
             </w:pPr>
             <w:r>
-              <w:rPr>
-                <w:b w:val="0"/>
-                <w:sz w:val="18"/>
-              </w:rPr>
               <w:t>Compiler messages and Security, Resources, Performance, and Duplication findings.</w:t>
             </w:r>
           </w:p>
@@ -324,10 +314,6 @@
               <w:spacing w:after="40" w:line="252" w:lineRule="auto"/>
             </w:pPr>
             <w:r>
-              <w:rPr>
-                <w:b w:val="0"/>
-                <w:sz w:val="18"/>
-              </w:rPr>
               <w:t>Compiler</w:t>
             </w:r>
           </w:p>
@@ -354,11 +340,7 @@
               <w:spacing w:after="40" w:line="252" w:lineRule="auto"/>
             </w:pPr>
             <w:r>
-              <w:rPr>
-                <w:b w:val="0"/>
-                <w:sz w:val="18"/>
-              </w:rPr>
-              <w:t>AST, symbols, tokens, selected semantic checks, and the unavailable data-flow stage.</w:t>
+              <w:t>AST, symbols, tokens, selected semantic checks, and scalar data flow with iteration traces.</w:t>
             </w:r>
           </w:p>
         </w:tc>
@@ -389,10 +371,6 @@
               <w:spacing w:after="40" w:line="252" w:lineRule="auto"/>
             </w:pPr>
             <w:r>
-              <w:rPr>
-                <w:b w:val="0"/>
-                <w:sz w:val="18"/>
-              </w:rPr>
               <w:t>Control flow</w:t>
             </w:r>
           </w:p>
@@ -419,10 +397,6 @@
               <w:spacing w:after="40" w:line="252" w:lineRule="auto"/>
             </w:pPr>
             <w:r>
-              <w:rPr>
-                <w:b w:val="0"/>
-                <w:sz w:val="18"/>
-              </w:rPr>
               <w:t>Basic blocks, branch and loop edges, block instructions, zoom, and pan.</w:t>
             </w:r>
           </w:p>
@@ -454,10 +428,6 @@
               <w:spacing w:after="40" w:line="252" w:lineRule="auto"/>
             </w:pPr>
             <w:r>
-              <w:rPr>
-                <w:b w:val="0"/>
-                <w:sz w:val="18"/>
-              </w:rPr>
               <w:t>Optimization</w:t>
             </w:r>
           </w:p>
@@ -484,10 +454,6 @@
               <w:spacing w:after="40" w:line="252" w:lineRule="auto"/>
             </w:pPr>
             <w:r>
-              <w:rPr>
-                <w:b w:val="0"/>
-                <w:sz w:val="18"/>
-              </w:rPr>
               <w:t>Original TAC, optimized TAC, and explanations of actual rewrites.</w:t>
             </w:r>
           </w:p>
@@ -499,6 +465,9 @@
         <w:pStyle w:val="Heading2"/>
       </w:pPr>
       <w:r>
+        <w:rPr>
+          <w:color w:val="000000"/>
+        </w:rPr>
         <w:t>Tokens and the syntax tree</w:t>
       </w:r>
     </w:p>
@@ -512,24 +481,26 @@
         <w:pStyle w:val="Heading2"/>
       </w:pPr>
       <w:r>
+        <w:rPr>
+          <w:color w:val="000000"/>
+        </w:rPr>
         <w:t>Symbols and selected semantic checks</w:t>
       </w:r>
     </w:p>
     <w:p>
       <w:r>
-        <w:t>The symbol table records declared names, types, scopes, and source locations. Separate symbol IDs distinguish variables that have the same name in different scopes. Resolved references show which declaration a use belongs to. Checks cover selected undeclared uses, duplicate declarations and definitions, conflicting supported function signatures, and whether a return has a value when required.</w:t>
-      </w:r>
-    </w:p>
-    <w:p>
-      <w:r>
-        <w:br w:type="page"/>
+        <w:t>The symbol table records declared names, types, scopes, and source locations. Separate symbol IDs distinguish variables that have the same name in different scopes. Resolved references show which declaration a use belongs to. Checks cover selected undeclared uses, duplicate declarations and definitions, conflicting supported function signatures, whether a return has a value when required, and whether supported non-void functions have explicit return paths.</w:t>
       </w:r>
     </w:p>
     <w:p>
       <w:pPr>
         <w:pStyle w:val="Heading1"/>
+        <w:pageBreakBefore/>
       </w:pPr>
       <w:r>
+        <w:rPr>
+          <w:color w:val="000000"/>
+        </w:rPr>
         <w:t>Intermediate code and optimization</w:t>
       </w:r>
     </w:p>
@@ -538,6 +509,9 @@
         <w:pStyle w:val="Heading2"/>
       </w:pPr>
       <w:r>
+        <w:rPr>
+          <w:color w:val="000000"/>
+        </w:rPr>
         <w:t>Three address code</w:t>
       </w:r>
     </w:p>
@@ -551,6 +525,9 @@
         <w:pStyle w:val="Heading2"/>
       </w:pPr>
       <w:r>
+        <w:rPr>
+          <w:color w:val="000000"/>
+        </w:rPr>
         <w:t>A worked example</w:t>
       </w:r>
     </w:p>
@@ -584,6 +561,9 @@
         <w:pStyle w:val="Heading2"/>
       </w:pPr>
       <w:r>
+        <w:rPr>
+          <w:color w:val="000000"/>
+        </w:rPr>
         <w:t>The two implemented optimization passes</w:t>
       </w:r>
     </w:p>
@@ -602,12 +582,15 @@
         <w:pStyle w:val="Heading2"/>
       </w:pPr>
       <w:r>
+        <w:rPr>
+          <w:color w:val="000000"/>
+        </w:rPr>
         <w:t>Control flow</w:t>
       </w:r>
     </w:p>
     <w:p>
       <w:r>
-        <w:t>A basic block is a sequence of instructions with a single control-transfer boundary. The control-flow graph connects these blocks with true, false, jump, fall-through, and return edges. Select a block to inspect its instructions. The graph comes from optimized TAC. Disconnected blocks remain visible because dead-code elimination is not implemented.</w:t>
+        <w:t>A basic block is a sequence of instructions with a single control-transfer boundary. The control-flow graph connects these blocks with true, false, jump, fall-through, and return edges. Select a block to inspect its instructions and follow incoming or outgoing edges. Fit graph gives an overview. The graph comes from optimized TAC. Disconnected blocks remain visible because dead-code elimination is not implemented.</w:t>
       </w:r>
     </w:p>
     <w:p>
@@ -616,8 +599,27 @@
       </w:r>
     </w:p>
     <w:p>
+      <w:pPr>
+        <w:pStyle w:val="Heading2"/>
+        <w:pageBreakBefore/>
+      </w:pPr>
       <w:r>
-        <w:br w:type="page"/>
+        <w:t>Scalar data flow</w:t>
+      </w:r>
+    </w:p>
+    <w:p>
+      <w:r>
+        <w:t>Live-variable analysis asks which values may be read later before another write replaces them. Reaching definitions asks which earlier writes may still supply a value. Both repeat equations over reachable blocks until nothing changes. This unchanged state is a fixed point. IN and OUT mean before and after a block; the trace shows actual changes in each round.</w:t>
+      </w:r>
+    </w:p>
+    <w:p>
+      <w:r>
+        <w:t>Compiler then Data flow shows both calculations on original TAC, before optimization simplifies source uses. Unknown incoming values, uninitialized declarations, and possible memory writes are labeled. Arrays and pointed-to memory contents are outside scalar definition sets. Functions that exceed the budgets receive an unavailable explanation instead of incomplete sets. No instruction-removal optimizer uses these results.</w:t>
+      </w:r>
+    </w:p>
+    <w:p>
+      <w:r>
+        <w:t>AST Source connections links a selected subtree to its tokens, resolved names, TAC records, and CFG blocks. Instructions explain operand types and effects. Tables show 100 rows per page. Arrow keys and Home or End navigate tabs; Esc then Tab leaves the editor. Failed or unreadable requests provide retry guidance, and browser requests time out after 20 seconds.</w:t>
       </w:r>
     </w:p>
     <w:p>
@@ -625,6 +627,9 @@
         <w:pStyle w:val="Heading1"/>
       </w:pPr>
       <w:r>
+        <w:rPr>
+          <w:color w:val="000000"/>
+        </w:rPr>
         <w:t>Code review features and reports</w:t>
       </w:r>
     </w:p>
@@ -633,12 +638,15 @@
         <w:pStyle w:val="Heading2"/>
       </w:pPr>
       <w:r>
+        <w:rPr>
+          <w:color w:val="000000"/>
+        </w:rPr>
         <w:t>Security findings</w:t>
       </w:r>
     </w:p>
     <w:p>
       <w:r>
-        <w:t>The rules inspect resolved library calls in the AST. They flag gets, capacity review for strcpy, strcat, and sprintf, and literal scanf-family formats with an unbounded unsuppressed %s. They also track limited local input provenance into system and identify credential-like names assigned string literals. Comments that merely mention these APIs are not treated as calls.</w:t>
+        <w:t>The rules inspect resolved library calls in the AST. They flag gets, capacity review for strcpy, strcat, and sprintf, and literal scanf-family formats with an unbounded unsuppressed %s or %[ conversion. They also track limited local input provenance into system and identify credential-like names assigned string literals. Comments that merely mention these APIs are not treated as calls.</w:t>
       </w:r>
     </w:p>
     <w:p>
@@ -651,6 +659,9 @@
         <w:pStyle w:val="Heading2"/>
       </w:pPr>
       <w:r>
+        <w:rPr>
+          <w:color w:val="000000"/>
+        </w:rPr>
         <w:t>Memory and resource hints</w:t>
       </w:r>
     </w:p>
@@ -664,6 +675,9 @@
         <w:pStyle w:val="Heading2"/>
       </w:pPr>
       <w:r>
+        <w:rPr>
+          <w:color w:val="000000"/>
+        </w:rPr>
         <w:t>Structure and duplication</w:t>
       </w:r>
     </w:p>
@@ -677,6 +691,9 @@
         <w:pStyle w:val="Heading2"/>
       </w:pPr>
       <w:r>
+        <w:rPr>
+          <w:color w:val="000000"/>
+        </w:rPr>
         <w:t>Export and privacy</w:t>
       </w:r>
     </w:p>
@@ -691,15 +708,14 @@
       </w:r>
     </w:p>
     <w:p>
-      <w:r>
-        <w:br w:type="page"/>
-      </w:r>
-    </w:p>
-    <w:p>
       <w:pPr>
         <w:pStyle w:val="Heading1"/>
+        <w:pageBreakBefore/>
       </w:pPr>
       <w:r>
+        <w:rPr>
+          <w:color w:val="000000"/>
+        </w:rPr>
         <w:t>Using and demonstrating CodeSentinel</w:t>
       </w:r>
     </w:p>
@@ -708,6 +724,9 @@
         <w:pStyle w:val="Heading2"/>
       </w:pPr>
       <w:r>
+        <w:rPr>
+          <w:color w:val="000000"/>
+        </w:rPr>
         <w:t>The normal user journey</w:t>
       </w:r>
     </w:p>
@@ -772,6 +791,9 @@
         <w:pStyle w:val="Heading2"/>
       </w:pPr>
       <w:r>
+        <w:rPr>
+          <w:color w:val="000000"/>
+        </w:rPr>
         <w:t>A demonstration in under three minutes</w:t>
       </w:r>
     </w:p>
@@ -811,10 +833,6 @@
               <w:spacing w:after="40" w:line="252" w:lineRule="auto"/>
             </w:pPr>
             <w:r>
-              <w:rPr>
-                <w:b/>
-                <w:sz w:val="18"/>
-              </w:rPr>
               <w:t>Time</w:t>
             </w:r>
           </w:p>
@@ -841,10 +859,6 @@
               <w:spacing w:after="40" w:line="252" w:lineRule="auto"/>
             </w:pPr>
             <w:r>
-              <w:rPr>
-                <w:b/>
-                <w:sz w:val="18"/>
-              </w:rPr>
               <w:t>Action</w:t>
             </w:r>
           </w:p>
@@ -876,10 +890,6 @@
               <w:spacing w:after="40" w:line="252" w:lineRule="auto"/>
             </w:pPr>
             <w:r>
-              <w:rPr>
-                <w:b w:val="0"/>
-                <w:sz w:val="18"/>
-              </w:rPr>
               <w:t>0 to 30 seconds</w:t>
             </w:r>
           </w:p>
@@ -906,10 +916,6 @@
               <w:spacing w:after="40" w:line="252" w:lineRule="auto"/>
             </w:pPr>
             <w:r>
-              <w:rPr>
-                <w:b w:val="0"/>
-                <w:sz w:val="18"/>
-              </w:rPr>
               <w:t>Analyze Full pipeline and show the overview.</w:t>
             </w:r>
           </w:p>
@@ -941,10 +947,6 @@
               <w:spacing w:after="40" w:line="252" w:lineRule="auto"/>
             </w:pPr>
             <w:r>
-              <w:rPr>
-                <w:b w:val="0"/>
-                <w:sz w:val="18"/>
-              </w:rPr>
               <w:t>30 to 65 seconds</w:t>
             </w:r>
           </w:p>
@@ -971,10 +973,6 @@
               <w:spacing w:after="40" w:line="252" w:lineRule="auto"/>
             </w:pPr>
             <w:r>
-              <w:rPr>
-                <w:b w:val="0"/>
-                <w:sz w:val="18"/>
-              </w:rPr>
               <w:t>Show an AST node and its symbol or token information.</w:t>
             </w:r>
           </w:p>
@@ -1006,10 +1004,6 @@
               <w:spacing w:after="40" w:line="252" w:lineRule="auto"/>
             </w:pPr>
             <w:r>
-              <w:rPr>
-                <w:b w:val="0"/>
-                <w:sz w:val="18"/>
-              </w:rPr>
               <w:t>65 to 100 seconds</w:t>
             </w:r>
           </w:p>
@@ -1036,10 +1030,6 @@
               <w:spacing w:after="40" w:line="252" w:lineRule="auto"/>
             </w:pPr>
             <w:r>
-              <w:rPr>
-                <w:b w:val="0"/>
-                <w:sz w:val="18"/>
-              </w:rPr>
               <w:t>Open the unbounded input finding and highlight scanf in the source.</w:t>
             </w:r>
           </w:p>
@@ -1071,10 +1061,6 @@
               <w:spacing w:after="40" w:line="252" w:lineRule="auto"/>
             </w:pPr>
             <w:r>
-              <w:rPr>
-                <w:b w:val="0"/>
-                <w:sz w:val="18"/>
-              </w:rPr>
               <w:t>100 to 135 seconds</w:t>
             </w:r>
           </w:p>
@@ -1101,10 +1087,6 @@
               <w:spacing w:after="40" w:line="252" w:lineRule="auto"/>
             </w:pPr>
             <w:r>
-              <w:rPr>
-                <w:b w:val="0"/>
-                <w:sz w:val="18"/>
-              </w:rPr>
               <w:t>Show an actual constant rewrite and explain folding and propagation.</w:t>
             </w:r>
           </w:p>
@@ -1136,10 +1118,6 @@
               <w:spacing w:after="40" w:line="252" w:lineRule="auto"/>
             </w:pPr>
             <w:r>
-              <w:rPr>
-                <w:b w:val="0"/>
-                <w:sz w:val="18"/>
-              </w:rPr>
               <w:t>135 to 160 seconds</w:t>
             </w:r>
           </w:p>
@@ -1166,11 +1144,7 @@
               <w:spacing w:after="40" w:line="252" w:lineRule="auto"/>
             </w:pPr>
             <w:r>
-              <w:rPr>
-                <w:b w:val="0"/>
-                <w:sz w:val="18"/>
-              </w:rPr>
-              <w:t>Select a CFG block and explain a branch or loop edge.</w:t>
+              <w:t>Select a CFG block, explain an edge, and show converged data flow.</w:t>
             </w:r>
           </w:p>
         </w:tc>
@@ -1201,10 +1175,6 @@
               <w:spacing w:after="40" w:line="252" w:lineRule="auto"/>
             </w:pPr>
             <w:r>
-              <w:rPr>
-                <w:b w:val="0"/>
-                <w:sz w:val="18"/>
-              </w:rPr>
               <w:t>160 to 180 seconds</w:t>
             </w:r>
           </w:p>
@@ -1231,10 +1201,6 @@
               <w:spacing w:after="40" w:line="252" w:lineRule="auto"/>
             </w:pPr>
             <w:r>
-              <w:rPr>
-                <w:b w:val="0"/>
-                <w:sz w:val="18"/>
-              </w:rPr>
               <w:t>Show the allocation hints and export the report.</w:t>
             </w:r>
           </w:p>
@@ -1246,6 +1212,9 @@
         <w:pStyle w:val="Heading2"/>
       </w:pPr>
       <w:r>
+        <w:rPr>
+          <w:color w:val="000000"/>
+        </w:rPr>
         <w:t>Useful learning samples</w:t>
       </w:r>
     </w:p>
@@ -1260,15 +1229,14 @@
       </w:r>
     </w:p>
     <w:p>
-      <w:r>
-        <w:br w:type="page"/>
-      </w:r>
-    </w:p>
-    <w:p>
       <w:pPr>
         <w:pStyle w:val="Heading1"/>
+        <w:pageBreakBefore/>
       </w:pPr>
       <w:r>
+        <w:rPr>
+          <w:color w:val="000000"/>
+        </w:rPr>
         <w:t>Local setup and product architecture</w:t>
       </w:r>
     </w:p>
@@ -1277,6 +1245,9 @@
         <w:pStyle w:val="Heading2"/>
       </w:pPr>
       <w:r>
+        <w:rPr>
+          <w:color w:val="000000"/>
+        </w:rPr>
         <w:t>Requirements and startup</w:t>
       </w:r>
     </w:p>
@@ -1309,6 +1280,9 @@
         <w:pStyle w:val="Heading2"/>
       </w:pPr>
       <w:r>
+        <w:rPr>
+          <w:color w:val="000000"/>
+        </w:rPr>
         <w:t>How the product works</w:t>
       </w:r>
     </w:p>
@@ -1365,6 +1339,9 @@
         <w:pStyle w:val="Heading2"/>
       </w:pPr>
       <w:r>
+        <w:rPr>
+          <w:color w:val="000000"/>
+        </w:rPr>
         <w:t>API and project folders</w:t>
       </w:r>
     </w:p>
@@ -1404,10 +1381,6 @@
               <w:spacing w:after="40" w:line="252" w:lineRule="auto"/>
             </w:pPr>
             <w:r>
-              <w:rPr>
-                <w:b/>
-                <w:sz w:val="18"/>
-              </w:rPr>
               <w:t>Endpoint</w:t>
             </w:r>
           </w:p>
@@ -1434,10 +1407,6 @@
               <w:spacing w:after="40" w:line="252" w:lineRule="auto"/>
             </w:pPr>
             <w:r>
-              <w:rPr>
-                <w:b/>
-                <w:sz w:val="18"/>
-              </w:rPr>
               <w:t>Purpose</w:t>
             </w:r>
           </w:p>
@@ -1469,10 +1438,6 @@
               <w:spacing w:after="40" w:line="252" w:lineRule="auto"/>
             </w:pPr>
             <w:r>
-              <w:rPr>
-                <w:b w:val="0"/>
-                <w:sz w:val="18"/>
-              </w:rPr>
               <w:t>GET /api/health</w:t>
             </w:r>
           </w:p>
@@ -1499,10 +1464,6 @@
               <w:spacing w:after="40" w:line="252" w:lineRule="auto"/>
             </w:pPr>
             <w:r>
-              <w:rPr>
-                <w:b w:val="0"/>
-                <w:sz w:val="18"/>
-              </w:rPr>
               <w:t>Reports application and parser identity.</w:t>
             </w:r>
           </w:p>
@@ -1534,10 +1495,6 @@
               <w:spacing w:after="40" w:line="252" w:lineRule="auto"/>
             </w:pPr>
             <w:r>
-              <w:rPr>
-                <w:b w:val="0"/>
-                <w:sz w:val="18"/>
-              </w:rPr>
               <w:t>GET /api/samples</w:t>
             </w:r>
           </w:p>
@@ -1564,10 +1521,6 @@
               <w:spacing w:after="40" w:line="252" w:lineRule="auto"/>
             </w:pPr>
             <w:r>
-              <w:rPr>
-                <w:b w:val="0"/>
-                <w:sz w:val="18"/>
-              </w:rPr>
               <w:t>Returns the bundled learning samples.</w:t>
             </w:r>
           </w:p>
@@ -1599,10 +1552,6 @@
               <w:spacing w:after="40" w:line="252" w:lineRule="auto"/>
             </w:pPr>
             <w:r>
-              <w:rPr>
-                <w:b w:val="0"/>
-                <w:sz w:val="18"/>
-              </w:rPr>
               <w:t>POST /api/analyze</w:t>
             </w:r>
           </w:p>
@@ -1629,10 +1578,6 @@
               <w:spacing w:after="40" w:line="252" w:lineRule="auto"/>
             </w:pPr>
             <w:r>
-              <w:rPr>
-                <w:b w:val="0"/>
-                <w:sz w:val="18"/>
-              </w:rPr>
               <w:t>Accepts source and an optional display filename; returns one analysis.</w:t>
             </w:r>
           </w:p>
@@ -1645,15 +1590,14 @@
       </w:r>
     </w:p>
     <w:p>
-      <w:r>
-        <w:br w:type="page"/>
-      </w:r>
-    </w:p>
-    <w:p>
       <w:pPr>
         <w:pStyle w:val="Heading1"/>
+        <w:pageBreakBefore/>
       </w:pPr>
       <w:r>
+        <w:rPr>
+          <w:color w:val="000000"/>
+        </w:rPr>
         <w:t>Limits and verification</w:t>
       </w:r>
     </w:p>
@@ -1662,6 +1606,9 @@
         <w:pStyle w:val="Heading2"/>
       </w:pPr>
       <w:r>
+        <w:rPr>
+          <w:color w:val="000000"/>
+        </w:rPr>
         <w:t>How to read availability</w:t>
       </w:r>
     </w:p>
@@ -1675,6 +1622,9 @@
         <w:pStyle w:val="Heading2"/>
       </w:pPr>
       <w:r>
+        <w:rPr>
+          <w:color w:val="000000"/>
+        </w:rPr>
         <w:t>Current limits</w:t>
       </w:r>
     </w:p>
@@ -1685,7 +1635,7 @@
     </w:p>
     <w:p>
       <w:r>
-        <w:t>TAC arithmetic is restricted to supported signed 32-bit decimal operands. Octal, hexadecimal, suffixed or wider arithmetic, pointer arithmetic, persistent local storage, and other unsupported cases are withheld. Full live-variable analysis, reaching definitions, dead-code elimination, and common subexpression elimination are not implemented. There are no user accounts, database, saved history, or hosted application deployment.</w:t>
+        <w:t>TAC arithmetic is restricted to supported signed 32-bit decimal operands. Octal, hexadecimal, suffixed or wider arithmetic, pointer arithmetic, persistent local storage, and other unsupported cases are withheld. Live variables and reaching definitions are implemented for scalar identities and temporaries, with actual iteration traces. Memory contents, dead-code elimination, and common subexpression elimination remain unavailable. There are no user accounts, database, saved history, or hosted application deployment.</w:t>
       </w:r>
     </w:p>
     <w:p>
@@ -1698,12 +1648,15 @@
         <w:pStyle w:val="Heading2"/>
       </w:pPr>
       <w:r>
+        <w:rPr>
+          <w:color w:val="000000"/>
+        </w:rPr>
         <w:t>What was verified</w:t>
       </w:r>
     </w:p>
     <w:p>
       <w:r>
-        <w:t>The 12 October 2026 local review passed 73 backend tests, the frontend production build, and 11 browser tests against the real Java backend. The browser suite includes three consecutive complete demo rehearsals, JSON export, syntax recovery, stale-result protection, upload, dialogs, and layouts at 320, 768, and 1440 pixels. Parser provenance checksums also passed.</w:t>
+        <w:t>The 12 October 2026 local review passed 90 backend tests, the frontend production build, and 16 browser tests against the real Java backend. The browser suite includes three consecutive complete demo rehearsals, JSON export, syntax recovery, stale-result protection, upload, dialogs, and layouts at 320, 390, 768, and 1440 pixels. Parser provenance checksums also passed.</w:t>
       </w:r>
     </w:p>
     <w:p>
@@ -1716,6 +1669,9 @@
         <w:pStyle w:val="Heading2"/>
       </w:pPr>
       <w:r>
+        <w:rPr>
+          <w:color w:val="000000"/>
+        </w:rPr>
         <w:t>Before a faculty demonstration</w:t>
       </w:r>
     </w:p>
@@ -2247,7 +2203,7 @@
       <w:rFonts w:asciiTheme="majorHAnsi" w:eastAsiaTheme="majorEastAsia" w:hAnsiTheme="majorHAnsi" w:cstheme="majorBidi"/>
       <w:b/>
       <w:bCs/>
-      <w:color w:val="4F81BD" w:themeColor="accent1"/>
+      <w:color w:val="000000"/>
     </w:rPr>
   </w:style>
   <w:style w:type="paragraph" w:styleId="Heading4">

</xml_diff>